<commit_message>
Documente le non-choix de RAGAS + aide-memoire Docker
- RAGAS : justification du non-usage au POC, inscrite dans tous les
  documents (journal J21, rapport 6.2, synthese, lessons 18, README,
  deroule, slide eval). Verification PyPI : ragas depend de openai +
  langchain_openai + datasets -> incoherent avec stack 100% Mistral,
  hors perimetre consigne. Garde en reco v1.
- Aide-memoire commandes Docker + tableau de persistance (bind mount)
  ajoutes au README, rapport (annexe), deroule (etape Docker) et
  synthese (section demo live).
- Docs et slides regeneres.

Co-Authored-By: Claude Opus 4.7 <noreply@anthropic.com>
</commit_message>
<xml_diff>
--- a/docs/deroule_projet.docx
+++ b/docs/deroule_projet.docx
@@ -817,6 +817,308 @@
       </w:r>
       <w:r>
         <w:t xml:space="preserve"> — aucune installation Python locale requise.</w:t>
+      </w:r>
+    </w:p>
+    <w:p>
+      <w:r>
+        <w:rPr>
+          <w:b/>
+        </w:rPr>
+        <w:t>Aide-mémoire des commandes Docker</w:t>
+      </w:r>
+      <w:r>
+        <w:t xml:space="preserve"> :</w:t>
+      </w:r>
+    </w:p>
+    <w:tbl>
+      <w:tblPr>
+        <w:tblStyle w:val="LightGrid-Accent1"/>
+        <w:tblW w:type="auto" w:w="0"/>
+        <w:tblLook w:firstColumn="1" w:firstRow="1" w:lastColumn="0" w:lastRow="0" w:noHBand="0" w:noVBand="1" w:val="04A0"/>
+      </w:tblPr>
+      <w:tblGrid>
+        <w:gridCol w:w="4680"/>
+        <w:gridCol w:w="4680"/>
+      </w:tblGrid>
+      <w:tr>
+        <w:tc>
+          <w:tcPr>
+            <w:tcW w:type="dxa" w:w="4680"/>
+          </w:tcPr>
+          <w:p>
+            <w:r>
+              <w:rPr>
+                <w:b/>
+              </w:rPr>
+              <w:t>Commande</w:t>
+            </w:r>
+          </w:p>
+        </w:tc>
+        <w:tc>
+          <w:tcPr>
+            <w:tcW w:type="dxa" w:w="4680"/>
+          </w:tcPr>
+          <w:p>
+            <w:r>
+              <w:rPr>
+                <w:b/>
+              </w:rPr>
+              <w:t>Rôle</w:t>
+            </w:r>
+          </w:p>
+        </w:tc>
+      </w:tr>
+      <w:tr>
+        <w:tc>
+          <w:tcPr>
+            <w:tcW w:type="dxa" w:w="4680"/>
+          </w:tcPr>
+          <w:p>
+            <w:r>
+              <w:t>`docker compose build`</w:t>
+            </w:r>
+          </w:p>
+        </w:tc>
+        <w:tc>
+          <w:tcPr>
+            <w:tcW w:type="dxa" w:w="4680"/>
+          </w:tcPr>
+          <w:p>
+            <w:r>
+              <w:t>Construit l'image (après modif de code)</w:t>
+            </w:r>
+          </w:p>
+        </w:tc>
+      </w:tr>
+      <w:tr>
+        <w:tc>
+          <w:tcPr>
+            <w:tcW w:type="dxa" w:w="4680"/>
+          </w:tcPr>
+          <w:p>
+            <w:r>
+              <w:t>`docker compose run --rm rag python scripts/pipeline.py`</w:t>
+            </w:r>
+          </w:p>
+        </w:tc>
+        <w:tc>
+          <w:tcPr>
+            <w:tcW w:type="dxa" w:w="4680"/>
+          </w:tcPr>
+          <w:p>
+            <w:r>
+              <w:t>fetch + tests + index (jetable)</w:t>
+            </w:r>
+          </w:p>
+        </w:tc>
+      </w:tr>
+      <w:tr>
+        <w:tc>
+          <w:tcPr>
+            <w:tcW w:type="dxa" w:w="4680"/>
+          </w:tcPr>
+          <w:p>
+            <w:r>
+              <w:t>`docker compose run --rm -it rag python scripts/03_run_chatbot_cli.py`</w:t>
+            </w:r>
+          </w:p>
+        </w:tc>
+        <w:tc>
+          <w:tcPr>
+            <w:tcW w:type="dxa" w:w="4680"/>
+          </w:tcPr>
+          <w:p>
+            <w:r>
+              <w:t>CLI interactif (`-it`)</w:t>
+            </w:r>
+          </w:p>
+        </w:tc>
+      </w:tr>
+      <w:tr>
+        <w:tc>
+          <w:tcPr>
+            <w:tcW w:type="dxa" w:w="4680"/>
+          </w:tcPr>
+          <w:p>
+            <w:r>
+              <w:t>`docker compose run --rm rag python scripts/05_evaluate.py --runs 3`</w:t>
+            </w:r>
+          </w:p>
+        </w:tc>
+        <w:tc>
+          <w:tcPr>
+            <w:tcW w:type="dxa" w:w="4680"/>
+          </w:tcPr>
+          <w:p>
+            <w:r>
+              <w:t>évaluation multi-run</w:t>
+            </w:r>
+          </w:p>
+        </w:tc>
+      </w:tr>
+      <w:tr>
+        <w:tc>
+          <w:tcPr>
+            <w:tcW w:type="dxa" w:w="4680"/>
+          </w:tcPr>
+          <w:p>
+            <w:r>
+              <w:t>`docker compose up rag`</w:t>
+            </w:r>
+          </w:p>
+        </w:tc>
+        <w:tc>
+          <w:tcPr>
+            <w:tcW w:type="dxa" w:w="4680"/>
+          </w:tcPr>
+          <w:p>
+            <w:r>
+              <w:t>démo Streamlit (port 8501)</w:t>
+            </w:r>
+          </w:p>
+        </w:tc>
+      </w:tr>
+      <w:tr>
+        <w:tc>
+          <w:tcPr>
+            <w:tcW w:type="dxa" w:w="4680"/>
+          </w:tcPr>
+          <w:p>
+            <w:r>
+              <w:t>`docker compose stop` / `start`</w:t>
+            </w:r>
+          </w:p>
+        </w:tc>
+        <w:tc>
+          <w:tcPr>
+            <w:tcW w:type="dxa" w:w="4680"/>
+          </w:tcPr>
+          <w:p>
+            <w:r>
+              <w:t>arrête / redémarre (conserve le container)</w:t>
+            </w:r>
+          </w:p>
+        </w:tc>
+      </w:tr>
+      <w:tr>
+        <w:tc>
+          <w:tcPr>
+            <w:tcW w:type="dxa" w:w="4680"/>
+          </w:tcPr>
+          <w:p>
+            <w:r>
+              <w:t>`docker compose down [--rmi local]`</w:t>
+            </w:r>
+          </w:p>
+        </w:tc>
+        <w:tc>
+          <w:tcPr>
+            <w:tcW w:type="dxa" w:w="4680"/>
+          </w:tcPr>
+          <w:p>
+            <w:r>
+              <w:t>supprime container (+ image)</w:t>
+            </w:r>
+          </w:p>
+        </w:tc>
+      </w:tr>
+      <w:tr>
+        <w:tc>
+          <w:tcPr>
+            <w:tcW w:type="dxa" w:w="4680"/>
+          </w:tcPr>
+          <w:p>
+            <w:r>
+              <w:t>`docker compose ps`</w:t>
+            </w:r>
+          </w:p>
+        </w:tc>
+        <w:tc>
+          <w:tcPr>
+            <w:tcW w:type="dxa" w:w="4680"/>
+          </w:tcPr>
+          <w:p>
+            <w:r>
+              <w:t>liste les containers</w:t>
+            </w:r>
+          </w:p>
+        </w:tc>
+      </w:tr>
+    </w:tbl>
+    <w:p/>
+    <w:p>
+      <w:r>
+        <w:rPr>
+          <w:b/>
+        </w:rPr>
+        <w:t>Persistance</w:t>
+      </w:r>
+      <w:r>
+        <w:t xml:space="preserve"> : </w:t>
+      </w:r>
+      <w:r>
+        <w:rPr>
+          <w:rFonts w:ascii="Consolas" w:hAnsi="Consolas"/>
+          <w:sz w:val="20"/>
+        </w:rPr>
+        <w:t>./data/</w:t>
+      </w:r>
+      <w:r>
+        <w:t xml:space="preserve"> est un </w:t>
+      </w:r>
+      <w:r>
+        <w:rPr>
+          <w:i/>
+        </w:rPr>
+        <w:t>bind mount</w:t>
+      </w:r>
+      <w:r>
+        <w:t xml:space="preserve"> (dossier du disque hôte) —</w:t>
+      </w:r>
+    </w:p>
+    <w:p>
+      <w:r>
+        <w:t xml:space="preserve">l'index FAISS et le cache survivent à </w:t>
+      </w:r>
+      <w:r>
+        <w:rPr>
+          <w:rFonts w:ascii="Consolas" w:hAnsi="Consolas"/>
+          <w:sz w:val="20"/>
+        </w:rPr>
+        <w:t>stop</w:t>
+      </w:r>
+      <w:r>
+        <w:t>/</w:t>
+      </w:r>
+      <w:r>
+        <w:rPr>
+          <w:rFonts w:ascii="Consolas" w:hAnsi="Consolas"/>
+          <w:sz w:val="20"/>
+        </w:rPr>
+        <w:t>start</w:t>
+      </w:r>
+      <w:r>
+        <w:t>/</w:t>
+      </w:r>
+      <w:r>
+        <w:rPr>
+          <w:rFonts w:ascii="Consolas" w:hAnsi="Consolas"/>
+          <w:sz w:val="20"/>
+        </w:rPr>
+        <w:t>down</w:t>
+      </w:r>
+      <w:r>
+        <w:t>. Seul l'état</w:t>
+      </w:r>
+    </w:p>
+    <w:p>
+      <w:r>
+        <w:t>mémoire Streamlit (session, historique) est éphémère ; l'index est</w:t>
+      </w:r>
+    </w:p>
+    <w:p>
+      <w:r>
+        <w:t>rechargé depuis le disque au redémarrage, sans ré-indexation.</w:t>
       </w:r>
     </w:p>
     <w:p>
@@ -1809,7 +2111,105 @@
         <w:t>data/eval/results.csv</w:t>
       </w:r>
       <w:r>
-        <w:t xml:space="preserve"> + résumé console.</w:t>
+        <w:t xml:space="preserve"> + résumé console. Mode multi-run</w:t>
+      </w:r>
+    </w:p>
+    <w:p>
+      <w:r>
+        <w:t>(</w:t>
+      </w:r>
+      <w:r>
+        <w:rPr>
+          <w:rFonts w:ascii="Consolas" w:hAnsi="Consolas"/>
+          <w:sz w:val="20"/>
+        </w:rPr>
+        <w:t>--runs N</w:t>
+      </w:r>
+      <w:r>
+        <w:t>) pour gérer la variance du juge LLM (moyenne ± écart-type).</w:t>
+      </w:r>
+    </w:p>
+    <w:p>
+      <w:r>
+        <w:rPr>
+          <w:b/>
+        </w:rPr>
+        <w:t>Pourquoi pas RAGAS ?</w:t>
+      </w:r>
+      <w:r>
+        <w:t xml:space="preserve"> RAGAS est le framework standard d'évaluation</w:t>
+      </w:r>
+    </w:p>
+    <w:p>
+      <w:r>
+        <w:t>RAG (faithfulness, answer relevancy, context precision/recall). Mais les</w:t>
+      </w:r>
+    </w:p>
+    <w:p>
+      <w:r>
+        <w:t>consignes demandent de comparer la réponse à l'annotation (même sens +</w:t>
+      </w:r>
+    </w:p>
+    <w:p>
+      <w:r>
+        <w:t>mêmes informations) — couvert par cosine + juge. Et vérification PyPI</w:t>
+      </w:r>
+    </w:p>
+    <w:p>
+      <w:r>
+        <w:t xml:space="preserve">faite : RAGAS dépend de </w:t>
+      </w:r>
+      <w:r>
+        <w:rPr>
+          <w:rFonts w:ascii="Consolas" w:hAnsi="Consolas"/>
+          <w:sz w:val="20"/>
+        </w:rPr>
+        <w:t>openai</w:t>
+      </w:r>
+      <w:r>
+        <w:t xml:space="preserve"> + </w:t>
+      </w:r>
+      <w:r>
+        <w:rPr>
+          <w:rFonts w:ascii="Consolas" w:hAnsi="Consolas"/>
+          <w:sz w:val="20"/>
+        </w:rPr>
+        <w:t>langchain_openai</w:t>
+      </w:r>
+      <w:r>
+        <w:t xml:space="preserve"> + </w:t>
+      </w:r>
+      <w:r>
+        <w:rPr>
+          <w:rFonts w:ascii="Consolas" w:hAnsi="Consolas"/>
+          <w:sz w:val="20"/>
+        </w:rPr>
+        <w:t>datasets</w:t>
+      </w:r>
+    </w:p>
+    <w:p>
+      <w:r>
+        <w:t>HuggingFace, ce qui importerait l'écosystème d'un concurrent dans un POC</w:t>
+      </w:r>
+    </w:p>
+    <w:p>
+      <w:r>
+        <w:t>100 % Mistral, pour des métriques hors-périmètre. Choix : éval maison au</w:t>
+      </w:r>
+    </w:p>
+    <w:p>
+      <w:r>
+        <w:t>POC, RAGAS en reco v1. À noter qu'on a réalisé « l'esprit RAGAS »</w:t>
+      </w:r>
+    </w:p>
+    <w:p>
+      <w:r>
+        <w:t>manuellement (faithfulness ≈ verrou de périmètre, context precision ≈</w:t>
+      </w:r>
+    </w:p>
+    <w:p>
+      <w:r>
+        <w:t>filtre anti-bruit).</w:t>
       </w:r>
     </w:p>
     <w:p>

</xml_diff>